<commit_message>
Anonymize report documents and drop internal planning drafts
</commit_message>
<xml_diff>
--- a/2026-10-15_institutional_demand_analytics_phase1/docs/Analytical_Indices_Reference.docx
+++ b/2026-10-15_institutional_demand_analytics_phase1/docs/Analytical_Indices_Reference.docx
@@ -30,7 +30,7 @@
           <w:color w:val="445566"/>
           <w:sz w:val="30"/>
         </w:rPr>
-        <w:t>Sodexo SLU Dining — Inventory &amp; Demand Analytics Report</w:t>
+        <w:t>Campus Dining — Inventory &amp; Demand Analytics Report</w:t>
       </w:r>
     </w:p>
     <w:p>
@@ -38,7 +38,7 @@
         <w:rPr>
           <w:sz w:val="24"/>
         </w:rPr>
-        <w:t>Prepared by: Data Analyst, Sodexo – Saint Louis University Dining Services</w:t>
+        <w:t>Prepared by: Olawale Ajibola Ashaolu, Data Analyst, Sodexo Dining Services</w:t>
       </w:r>
     </w:p>
     <w:p>
@@ -58,7 +58,7 @@
           <w:i/>
           <w:sz w:val="20"/>
         </w:rPr>
-        <w:t>Sources: Sodexo Inventory Summary History Report (INRHTSUM, 505 pages, W/E 04/03/2026 – 10/09/2026); Grand Hall Day Parts Report (October 7, 2026).</w:t>
+        <w:t>Sources: Inventory Summary History Report (505 pages, W/E 04/03/2026 – 10/09/2026); Unit A Day Parts Report (October 7, 2026).</w:t>
       </w:r>
     </w:p>
     <w:p>
@@ -72,12 +72,12 @@
     </w:p>
     <w:p>
       <w:r>
-        <w:t>This document lists every key index, statistical measure, and analytical metric used in the Sodexo SLU Dining Data Analysis Report (October 2026). The indices are drawn from the Sodexo Inventory Summary History Report (Report ID: INRHTSUM, 505 pages, W/E 04/03/2026 – 10/09/2026) and the Grand Hall Day Parts Report (October 7, 2026).</w:t>
+        <w:t>This document lists every key index, statistical measure, and analytical metric used in the Campus Dining Data Analysis Report (October 2026). The indices are drawn from the Inventory Summary History Report (505 pages, W/E 04/03/2026 – 10/09/2026) and the Unit A Day Parts Report (October 7, 2026).</w:t>
       </w:r>
     </w:p>
     <w:p>
       <w:r>
-        <w:t>Each index is defined, its formula or derivation is stated, its computed value for SLU is given where applicable, and its analytical purpose is explained. These indices collectively form the quantitative backbone of the eight operational recommendations and the NIW Phase I baseline record.</w:t>
+        <w:t>Each index is defined, its formula or derivation is stated, its computed value for the client institution is given where applicable, and its analytical purpose is explained. These indices collectively form the quantitative backbone of the eight operational recommendations and the Phase I baseline record.</w:t>
       </w:r>
     </w:p>
     <w:p>
@@ -184,7 +184,7 @@
                 <w:color w:val="FFFFFF"/>
                 <w:sz w:val="19"/>
               </w:rPr>
-              <w:t>SLU Value(s)</w:t>
+              <w:t>Value(s)</w:t>
             </w:r>
           </w:p>
         </w:tc>
@@ -290,7 +290,7 @@
               <w:rPr>
                 <w:sz w:val="18"/>
               </w:rPr>
-              <w:t>Establishes the current financial scale of on-hand inventory; used as portfolio benchmark and NIW impact baseline</w:t>
+              <w:t>Establishes the current financial scale of on-hand inventory; used as portfolio benchmark and Phase I impact baseline</w:t>
             </w:r>
           </w:p>
         </w:tc>
@@ -451,7 +451,7 @@
               <w:rPr>
                 <w:sz w:val="18"/>
               </w:rPr>
-              <w:t>Grand Dining +50.25% ($24,832.87 → $37,311.63); Reinert To Go +48.0% ($7,308.22 → $10,819.42); Qdoba +57.3%; Panera +62.0%; Catering −1.16% ($29,737.73 → $29,393.10); Starbucks −5.24% ($30,651.52 → $29,045.65)</w:t>
+              <w:t>Unit A +50.25% ($24,832.87 → $37,311.63); Unit N +48.0% ($7,308.22 → $10,819.42); Unit I +57.3%; Unit D +62.0%; Unit B −1.16% ($29,737.73 → $29,393.10); Unit O −5.24% ($30,651.52 → $29,045.65)</w:t>
             </w:r>
           </w:p>
         </w:tc>
@@ -541,7 +541,7 @@
               <w:rPr>
                 <w:sz w:val="18"/>
               </w:rPr>
-              <w:t>Grand Dining = +$307.67 per week (≈ $1,230 per month accumulation)</w:t>
+              <w:t>Unit A = +$307.67 per week (≈ $1,230 per month accumulation)</w:t>
             </w:r>
           </w:p>
         </w:tc>
@@ -628,7 +628,7 @@
               <w:rPr>
                 <w:sz w:val="18"/>
               </w:rPr>
-              <w:t>Grand Dining: $47,299.91 − $21,700.53 = $25,599.38; Starbucks: $38,792.32 − $15,598.65 = $23,193.67; Panera: $77,772.81 − $12,201.80 = $65,571.01 (includes outlier)</w:t>
+              <w:t>Unit A: $47,299.91 − $21,700.53 = $25,599.38; Unit O: $38,792.32 − $15,598.65 = $23,193.67; Unit D: $77,772.81 − $12,201.80 = $65,571.01 (includes outlier)</w:t>
             </w:r>
           </w:p>
         </w:tc>
@@ -718,7 +718,7 @@
               <w:rPr>
                 <w:sz w:val="18"/>
               </w:rPr>
-              <w:t>Grand Dining $8,477.02; Panera $12,068.12; Starbucks $5,784.07; Catering $2,160.16; Subway $1,850.59; WOW Cafe $1,292.35</w:t>
+              <w:t>Unit A $8,477.02; Unit D $12,068.12; Unit O $5,784.07; Unit B $2,160.16; Unit H $1,850.59; Unit P $1,292.35</w:t>
             </w:r>
           </w:p>
         </w:tc>
@@ -805,7 +805,7 @@
               <w:rPr>
                 <w:sz w:val="18"/>
               </w:rPr>
-              <w:t>Ameren Cafe 0.72 (most volatile relative to size); Panera 0.65; Reinert To Go 0.53; Fusz Simply To Go 0.43; Starbucks 0.27; Grand Dining 0.26; Subway 0.22; WOW Cafe 0.09; Catering 0.07 (most stable)</w:t>
+              <w:t>Unit K 0.72 (most volatile relative to size); Unit D 0.65; Unit N 0.53; Unit G 0.43; Unit O 0.27; Unit A 0.26; Unit H 0.22; Unit P 0.09; Unit B 0.07 (most stable)</w:t>
             </w:r>
           </w:p>
         </w:tc>
@@ -982,7 +982,7 @@
               <w:rPr>
                 <w:sz w:val="18"/>
               </w:rPr>
-              <w:t>Peak $263,943.40 (W/E 04/10/2026, inflated by Panera outlier); Low $126,289.65 (W/E 07/10/2026, summer session)</w:t>
+              <w:t>Peak $263,943.40 (W/E 04/10/2026, inflated by Unit D outlier); Low $126,289.65 (W/E 07/10/2026, summer session)</w:t>
             </w:r>
           </w:p>
         </w:tc>
@@ -1072,7 +1072,7 @@
               <w:rPr>
                 <w:sz w:val="18"/>
               </w:rPr>
-              <w:t>W/E 10/09: Grand Dining 17.0%; Catering 13.4%; Starbucks 13.2%; Panera 11.5%; Fusz Simply To Go 9.8%; BSC Simply To Go 8.9%; WOW Cafe 6.4%; Ameren Cafe 6.0%; Reinert To Go 4.9%; Qdoba 4.8%; Subway 4.2%</w:t>
+              <w:t>W/E 10/09: Unit A 17.0%; Unit B 13.4%; Unit O 13.2%; Unit D 11.5%; Unit G 9.8%; Unit F 8.9%; Unit P 6.4%; Unit K 6.0%; Unit N 4.9%; Unit I 4.8%; Unit H 4.2%</w:t>
             </w:r>
           </w:p>
         </w:tc>
@@ -1200,7 +1200,7 @@
                 <w:color w:val="FFFFFF"/>
                 <w:sz w:val="19"/>
               </w:rPr>
-              <w:t>SLU Value(s)</w:t>
+              <w:t>Value(s)</w:t>
             </w:r>
           </w:p>
         </w:tc>
@@ -1290,7 +1290,7 @@
               <w:rPr>
                 <w:sz w:val="18"/>
               </w:rPr>
-              <w:t>Reinert To Go 56% (15 of 27 transitions, 28 weeks); Ameren Cafe 56% (15/27); Subway 48% (13/27); Grand Dining 26% (7/27); Fusz Simply To Go 26%; WOW Cafe 43% (3/7 measured transitions)</w:t>
+              <w:t>Unit N 56% (15 of 27 transitions, 28 weeks); Unit K 56% (15/27); Unit H 48% (13/27); Unit A 26% (7/27); Unit G 26%; Unit P 43% (3/7 measured transitions)</w:t>
             </w:r>
           </w:p>
         </w:tc>
@@ -1644,7 +1644,7 @@
               <w:rPr>
                 <w:sz w:val="18"/>
               </w:rPr>
-              <w:t>0 ÷ 409 = 0% (both Produce and Sysco templates, Grand Hall)</w:t>
+              <w:t>0 ÷ 409 = 0% (both Produce and Sysco templates, Unit A)</w:t>
             </w:r>
           </w:p>
         </w:tc>
@@ -1862,7 +1862,7 @@
                 <w:color w:val="FFFFFF"/>
                 <w:sz w:val="19"/>
               </w:rPr>
-              <w:t>SLU Value(s)</w:t>
+              <w:t>Value(s)</w:t>
             </w:r>
           </w:p>
         </w:tc>
@@ -1952,7 +1952,7 @@
               <w:rPr>
                 <w:sz w:val="18"/>
               </w:rPr>
-              <w:t>Grand Hall, Oct 7, 2026: Breakfast 604; Lunch 941; Dinner 992; Daily Total 2,537</w:t>
+              <w:t>Unit A, Oct 7, 2026: Breakfast 604; Lunch 941; Dinner 992; Daily Total 2,537</w:t>
             </w:r>
           </w:p>
         </w:tc>
@@ -2348,7 +2348,7 @@
         <w:rPr>
           <w:i/>
         </w:rPr>
-        <w:t>The following indices are the target performance metrics for the predictive analytics system to be built in Phase I of the NIW project. Baselines will be established from historical data; post-deployment actuals will be compared against these baselines to quantify impact.</w:t>
+        <w:t>The following indices are the target performance metrics for the predictive analytics system to be built in Phase I of the project. Baselines will be established from historical data; post-deployment actuals will be compared against these baselines to quantify impact.</w:t>
       </w:r>
     </w:p>
     <w:tbl>
@@ -2447,7 +2447,7 @@
                 <w:color w:val="FFFFFF"/>
                 <w:sz w:val="19"/>
               </w:rPr>
-              <w:t>SLU Value(s)</w:t>
+              <w:t>Value(s)</w:t>
             </w:r>
           </w:p>
         </w:tc>
@@ -2553,7 +2553,7 @@
               <w:rPr>
                 <w:sz w:val="18"/>
               </w:rPr>
-              <w:t>Primary NIW validation metric; quantifies how much more accurately the model forecasts demand versus the current manual ordering process</w:t>
+              <w:t>Primary validation metric; quantifies how much more accurately the model forecasts demand versus the current manual ordering process</w:t>
             </w:r>
           </w:p>
         </w:tc>
@@ -2627,7 +2627,7 @@
               <w:rPr>
                 <w:sz w:val="18"/>
               </w:rPr>
-              <w:t>To be computed post-model development (Stage 5 of NIW Phase I plan)</w:t>
+              <w:t>To be computed post-model development (Stage 5 of the Phase I plan)</w:t>
             </w:r>
           </w:p>
         </w:tc>
@@ -2804,7 +2804,7 @@
               <w:rPr>
                 <w:sz w:val="18"/>
               </w:rPr>
-              <w:t>Illustrative — sales data pending full integration: Grand Dining inventory $37,311.63 ÷ weekly swipe-equivalent revenue; Starbucks $29,045.65 ÷ weekly sales (to be computed from POS history)</w:t>
+              <w:t>Illustrative — sales data pending full integration: Unit A inventory $37,311.63 ÷ weekly swipe-equivalent revenue; Unit O $29,045.65 ÷ weekly sales (to be computed from POS history)</w:t>
             </w:r>
           </w:p>
         </w:tc>
@@ -2907,7 +2907,7 @@
               <w:rPr>
                 <w:sz w:val="18"/>
               </w:rPr>
-              <w:t>Service reliability metric; post-deployment reduction in stock-out rate is a key NIW impact measure</w:t>
+              <w:t>Service reliability metric; post-deployment reduction in stock-out rate is a key impact measure</w:t>
             </w:r>
           </w:p>
         </w:tc>
@@ -2998,7 +2998,7 @@
               <w:rPr>
                 <w:sz w:val="18"/>
               </w:rPr>
-              <w:t>Financial impact metric; cumulative procurement cost savings are a primary NIW quantitative benefit measure</w:t>
+              <w:t>Financial impact metric; cumulative procurement cost savings are a primary quantitative benefit measure</w:t>
             </w:r>
           </w:p>
         </w:tc>
@@ -3109,7 +3109,7 @@
                 <w:color w:val="FFFFFF"/>
                 <w:sz w:val="19"/>
               </w:rPr>
-              <w:t>SLU Value(s)</w:t>
+              <w:t>Value(s)</w:t>
             </w:r>
           </w:p>
         </w:tc>
@@ -3323,7 +3323,7 @@
     </w:p>
     <w:p>
       <w:r>
-        <w:t>The table below consolidates all 29 indices for quick reference, listing each index's category and its single most important SLU-specific value.</w:t>
+        <w:t>The table below consolidates all 29 indices for quick reference, listing each index's category and its single most important institution-specific value.</w:t>
       </w:r>
     </w:p>
     <w:tbl>
@@ -3421,7 +3421,7 @@
                 <w:color w:val="FFFFFF"/>
                 <w:sz w:val="20"/>
               </w:rPr>
-              <w:t>Key SLU Value</w:t>
+              <w:t>Key Value</w:t>
             </w:r>
           </w:p>
         </w:tc>
@@ -3635,7 +3635,7 @@
               <w:rPr>
                 <w:sz w:val="19"/>
               </w:rPr>
-              <w:t>Grand Dining +50.25%</w:t>
+              <w:t>Unit A +50.25%</w:t>
             </w:r>
           </w:p>
         </w:tc>
@@ -3709,7 +3709,7 @@
               <w:rPr>
                 <w:sz w:val="19"/>
               </w:rPr>
-              <w:t>Grand Dining +$307.67/week</w:t>
+              <w:t>Unit A +$307.67/week</w:t>
             </w:r>
           </w:p>
         </w:tc>
@@ -3779,7 +3779,7 @@
               <w:rPr>
                 <w:sz w:val="19"/>
               </w:rPr>
-              <w:t>Grand Dining $25,599.38</w:t>
+              <w:t>Unit A $25,599.38</w:t>
             </w:r>
           </w:p>
         </w:tc>
@@ -3853,7 +3853,7 @@
               <w:rPr>
                 <w:sz w:val="19"/>
               </w:rPr>
-              <w:t>Panera $12,068.12 (highest)</w:t>
+              <w:t>Unit D $12,068.12 (highest)</w:t>
             </w:r>
           </w:p>
         </w:tc>
@@ -3923,7 +3923,7 @@
               <w:rPr>
                 <w:sz w:val="19"/>
               </w:rPr>
-              <w:t>Ameren Cafe 0.72; Catering 0.07</w:t>
+              <w:t>Unit K 0.72; Unit B 0.07</w:t>
             </w:r>
           </w:p>
         </w:tc>
@@ -4211,7 +4211,7 @@
               <w:rPr>
                 <w:sz w:val="19"/>
               </w:rPr>
-              <w:t>Reinert To Go &amp; Ameren Cafe 56%</w:t>
+              <w:t>Unit N &amp; Unit K 56%</w:t>
             </w:r>
           </w:p>
         </w:tc>
@@ -4643,7 +4643,7 @@
               <w:rPr>
                 <w:sz w:val="19"/>
               </w:rPr>
-              <w:t>2,537 items/day (Grand Hall)</w:t>
+              <w:t>2,537 items/day (Unit A)</w:t>
             </w:r>
           </w:p>
         </w:tc>
@@ -5602,17 +5602,19 @@
           <w:i/>
           <w:sz w:val="20"/>
         </w:rPr>
-        <w:t>Data notes: Stale Count Rates are computed over week-to-week transitions (27 transitions across 28 weekly records per unit). Growth rates for Catering and Starbucks are calculated directly from the start and end subsection totals in the INRHTSUM report. SLU has no receiving logs and no waste logs; indices that would depend on them (e.g., fill rate, waste rate) are therefore excluded from this framework until such records are established.</w:t>
+        <w:t>Data notes: Stale Count Rates are computed over week-to-week transitions (27 transitions across 28 weekly records per unit). Growth rates for Unit B and Unit O are calculated directly from the start and end subsection totals in the inventory report. The client institution has no receiving logs and no waste logs; indices that would depend on them (e.g., fill rate, waste rate) are therefore excluded from this framework until such records are established.</w:t>
       </w:r>
     </w:p>
     <w:p>
       <w:r>
-        <w:t>Together, these 29 indices constitute the full quantitative framework for the Sodexo SLU Dining Phase I analytics project. Baselines recorded now — before predictive models are deployed — become the before-and-after comparison that demonstrates measurable improvement and substantiates the NIW petition's claim of national benefit.</w:t>
+        <w:t>Together, these 29 indices constitute the full quantitative framework for the Campus Dining Phase I analytics project. Baselines recorded now — before predictive models are deployed — become the before-and-after comparison that demonstrates measurable improvement and quantifies the benefit of the approach beyond a single institution.</w:t>
       </w:r>
     </w:p>
     <w:sectPr>
       <w:headerReference w:type="default" r:id="rId9"/>
       <w:footerReference w:type="default" r:id="rId10"/>
+      <w:headerReference w:type="first" r:id="rId11"/>
+      <w:footerReference w:type="first" r:id="rId12"/>
       <w:pgSz w:w="12240" w:h="15840"/>
       <w:pgMar w:top="1440" w:right="1440" w:bottom="1440" w:left="1440" w:header="720" w:footer="720" w:gutter="0"/>
       <w:cols w:space="720"/>
@@ -5670,6 +5672,16 @@
 </w:ftr>
 </file>
 
+<file path=word/footer2.xml><?xml version="1.0" encoding="utf-8"?>
+<w:ftr xmlns:m="http://schemas.openxmlformats.org/officeDocument/2006/math" xmlns:mc="http://schemas.openxmlformats.org/markup-compatibility/2006" xmlns:mo="http://schemas.microsoft.com/office/mac/office/2008/main" xmlns:mv="urn:schemas-microsoft-com:mac:vml" xmlns:o="urn:schemas-microsoft-com:office:office" xmlns:r="http://schemas.openxmlformats.org/officeDocument/2006/relationships" xmlns:v="urn:schemas-microsoft-com:vml" xmlns:w10="urn:schemas-microsoft-com:office:word" xmlns:w14="http://schemas.microsoft.com/office/word/2010/wordml" xmlns:w="http://schemas.openxmlformats.org/wordprocessingml/2006/main" xmlns:wne="http://schemas.microsoft.com/office/word/2006/wordml" xmlns:wp14="http://schemas.microsoft.com/office/word/2010/wordprocessingDrawing" xmlns:wp="http://schemas.openxmlformats.org/drawingml/2006/wordprocessingDrawing" xmlns:wpc="http://schemas.microsoft.com/office/word/2010/wordprocessingCanvas" xmlns:wpg="http://schemas.microsoft.com/office/word/2010/wordprocessingGroup" xmlns:wpi="http://schemas.microsoft.com/office/word/2010/wordprocessingInk" xmlns:wps="http://schemas.microsoft.com/office/word/2010/wordprocessingShape" mc:Ignorable="w14 wp14">
+  <w:p>
+    <w:pPr>
+      <w:pStyle w:val="Footer"/>
+    </w:pPr>
+  </w:p>
+</w:ftr>
+</file>
+
 <file path=word/header1.xml><?xml version="1.0" encoding="utf-8"?>
 <w:hdr xmlns:m="http://schemas.openxmlformats.org/officeDocument/2006/math" xmlns:mc="http://schemas.openxmlformats.org/markup-compatibility/2006" xmlns:mo="http://schemas.microsoft.com/office/mac/office/2008/main" xmlns:mv="urn:schemas-microsoft-com:mac:vml" xmlns:o="urn:schemas-microsoft-com:office:office" xmlns:r="http://schemas.openxmlformats.org/officeDocument/2006/relationships" xmlns:v="urn:schemas-microsoft-com:vml" xmlns:w10="urn:schemas-microsoft-com:office:word" xmlns:w14="http://schemas.microsoft.com/office/word/2010/wordml" xmlns:w="http://schemas.openxmlformats.org/wordprocessingml/2006/main" xmlns:wne="http://schemas.microsoft.com/office/word/2006/wordml" xmlns:wp14="http://schemas.microsoft.com/office/word/2010/wordprocessingDrawing" xmlns:wp="http://schemas.openxmlformats.org/drawingml/2006/wordprocessingDrawing" xmlns:wpc="http://schemas.microsoft.com/office/word/2010/wordprocessingCanvas" xmlns:wpg="http://schemas.microsoft.com/office/word/2010/wordprocessingGroup" xmlns:wpi="http://schemas.microsoft.com/office/word/2010/wordprocessingInk" xmlns:wps="http://schemas.microsoft.com/office/word/2010/wordprocessingShape" mc:Ignorable="w14 wp14">
   <w:p>
@@ -5683,8 +5695,18 @@
         <w:color w:val="1F3A5F"/>
         <w:sz w:val="18"/>
       </w:rPr>
-      <w:t>Key Analytical Indices — Sodexo SLU Dining Data Analysis</w:t>
+      <w:t>Key Analytical Indices — Campus Dining Data Analysis</w:t>
     </w:r>
+  </w:p>
+</w:hdr>
+</file>
+
+<file path=word/header2.xml><?xml version="1.0" encoding="utf-8"?>
+<w:hdr xmlns:m="http://schemas.openxmlformats.org/officeDocument/2006/math" xmlns:mc="http://schemas.openxmlformats.org/markup-compatibility/2006" xmlns:mo="http://schemas.microsoft.com/office/mac/office/2008/main" xmlns:mv="urn:schemas-microsoft-com:mac:vml" xmlns:o="urn:schemas-microsoft-com:office:office" xmlns:r="http://schemas.openxmlformats.org/officeDocument/2006/relationships" xmlns:v="urn:schemas-microsoft-com:vml" xmlns:w10="urn:schemas-microsoft-com:office:word" xmlns:w14="http://schemas.microsoft.com/office/word/2010/wordml" xmlns:w="http://schemas.openxmlformats.org/wordprocessingml/2006/main" xmlns:wne="http://schemas.microsoft.com/office/word/2006/wordml" xmlns:wp14="http://schemas.microsoft.com/office/word/2010/wordprocessingDrawing" xmlns:wp="http://schemas.openxmlformats.org/drawingml/2006/wordprocessingDrawing" xmlns:wpc="http://schemas.microsoft.com/office/word/2010/wordprocessingCanvas" xmlns:wpg="http://schemas.microsoft.com/office/word/2010/wordprocessingGroup" xmlns:wpi="http://schemas.microsoft.com/office/word/2010/wordprocessingInk" xmlns:wps="http://schemas.microsoft.com/office/word/2010/wordprocessingShape" mc:Ignorable="w14 wp14">
+  <w:p>
+    <w:pPr>
+      <w:pStyle w:val="Header"/>
+    </w:pPr>
   </w:p>
 </w:hdr>
 </file>

</xml_diff>